<commit_message>
Fixed weeks on sprint retrospectives and reviews. added timetable
</commit_message>
<xml_diff>
--- a/Sprints/Sprint Retrospectives/Sprint Retrospektiv Uke 10.docx
+++ b/Sprints/Sprint Retrospectives/Sprint Retrospektiv Uke 10.docx
@@ -7,10 +7,16 @@
         <w:pStyle w:val="Title"/>
       </w:pPr>
       <w:r>
-        <w:t xml:space="preserve">Sprint Retrospektiv Iteration </w:t>
-      </w:r>
-      <w:r>
-        <w:t>8</w:t>
+        <w:t xml:space="preserve">Sprint Retrospektiv </w:t>
+      </w:r>
+      <w:r>
+        <w:t>Uke</w:t>
+      </w:r>
+      <w:r>
+        <w:t xml:space="preserve"> </w:t>
+      </w:r>
+      <w:r>
+        <w:t>10</w:t>
       </w:r>
     </w:p>
     <w:tbl>
@@ -160,7 +166,13 @@
               <w:pStyle w:val="BodyText"/>
             </w:pPr>
             <w:r>
-              <w:t>09/02/2026</w:t>
+              <w:t>09/0</w:t>
+            </w:r>
+            <w:r>
+              <w:t>3</w:t>
+            </w:r>
+            <w:r>
+              <w:t>/2026</w:t>
             </w:r>
           </w:p>
         </w:tc>
@@ -493,8 +505,8 @@
     <w:p/>
     <w:p/>
     <w:sectPr>
-      <w:headerReference w:type="default" r:id="rId5"/>
-      <w:footerReference w:type="default" r:id="rId6"/>
+      <w:headerReference w:type="default" r:id="rId7"/>
+      <w:footerReference w:type="default" r:id="rId8"/>
       <w:pgSz w:w="11900" w:h="16840"/>
       <w:pgMar w:top="1417" w:right="1417" w:bottom="1417" w:left="1417" w:header="708" w:footer="708" w:gutter="0"/>
       <w:cols w:space="708"/>
@@ -504,6 +516,25 @@
 </w:document>
 </file>
 
+<file path=word/endnotes.xml><?xml version="1.0" encoding="utf-8"?>
+<w:endnotes xmlns:wpc="http://schemas.microsoft.com/office/word/2010/wordprocessingCanvas" xmlns:cx="http://schemas.microsoft.com/office/drawing/2014/chartex" xmlns:cx1="http://schemas.microsoft.com/office/drawing/2015/9/8/chartex" xmlns:cx2="http://schemas.microsoft.com/office/drawing/2015/10/21/chartex" xmlns:cx3="http://schemas.microsoft.com/office/drawing/2016/5/9/chartex" xmlns:cx4="http://schemas.microsoft.com/office/drawing/2016/5/10/chartex" xmlns:cx5="http://schemas.microsoft.com/office/drawing/2016/5/11/chartex" xmlns:cx6="http://schemas.microsoft.com/office/drawing/2016/5/12/chartex" xmlns:cx7="http://schemas.microsoft.com/office/drawing/2016/5/13/chartex" xmlns:cx8="http://schemas.microsoft.com/office/drawing/2016/5/14/chartex" xmlns:mc="http://schemas.openxmlformats.org/markup-compatibility/2006" xmlns:aink="http://schemas.microsoft.com/office/drawing/2016/ink" xmlns:am3d="http://schemas.microsoft.com/office/drawing/2017/model3d" xmlns:o="urn:schemas-microsoft-com:office:office" xmlns:oel="http://schemas.microsoft.com/office/2019/extlst" xmlns:r="http://schemas.openxmlformats.org/officeDocument/2006/relationships" xmlns:m="http://schemas.openxmlformats.org/officeDocument/2006/math" xmlns:v="urn:schemas-microsoft-com:vml" xmlns:wp14="http://schemas.microsoft.com/office/word/2010/wordprocessingDrawing" xmlns:wp="http://schemas.openxmlformats.org/drawingml/2006/wordprocessingDrawing" xmlns:w10="urn:schemas-microsoft-com:office:word" xmlns:w="http://schemas.openxmlformats.org/wordprocessingml/2006/main" xmlns:w14="http://schemas.microsoft.com/office/word/2010/wordml" xmlns:w15="http://schemas.microsoft.com/office/word/2012/wordml" xmlns:w16cex="http://schemas.microsoft.com/office/word/2018/wordml/cex" xmlns:w16cid="http://schemas.microsoft.com/office/word/2016/wordml/cid" xmlns:w16="http://schemas.microsoft.com/office/word/2018/wordml" xmlns:w16du="http://schemas.microsoft.com/office/word/2023/wordml/word16du" xmlns:w16sdtdh="http://schemas.microsoft.com/office/word/2020/wordml/sdtdatahash" xmlns:w16sdtfl="http://schemas.microsoft.com/office/word/2024/wordml/sdtformatlock" xmlns:w16se="http://schemas.microsoft.com/office/word/2015/wordml/symex" xmlns:wpg="http://schemas.microsoft.com/office/word/2010/wordprocessingGroup" xmlns:wpi="http://schemas.microsoft.com/office/word/2010/wordprocessingInk" xmlns:wne="http://schemas.microsoft.com/office/word/2006/wordml" xmlns:wps="http://schemas.microsoft.com/office/word/2010/wordprocessingShape" mc:Ignorable="w14 w15 w16se w16cid w16 w16cex w16sdtdh w16sdtfl w16du wp14">
+  <w:endnote w:type="separator" w:id="-1">
+    <w:p>
+      <w:r>
+        <w:separator/>
+      </w:r>
+    </w:p>
+  </w:endnote>
+  <w:endnote w:type="continuationSeparator" w:id="0">
+    <w:p>
+      <w:r>
+        <w:continuationSeparator/>
+      </w:r>
+    </w:p>
+  </w:endnote>
+</w:endnotes>
+</file>
+
 <file path=word/footer1.xml><?xml version="1.0" encoding="utf-8"?>
 <w:ftr xmlns:wpc="http://schemas.microsoft.com/office/word/2010/wordprocessingCanvas" xmlns:cx="http://schemas.microsoft.com/office/drawing/2014/chartex" xmlns:cx1="http://schemas.microsoft.com/office/drawing/2015/9/8/chartex" xmlns:cx2="http://schemas.microsoft.com/office/drawing/2015/10/21/chartex" xmlns:cx3="http://schemas.microsoft.com/office/drawing/2016/5/9/chartex" xmlns:cx4="http://schemas.microsoft.com/office/drawing/2016/5/10/chartex" xmlns:cx5="http://schemas.microsoft.com/office/drawing/2016/5/11/chartex" xmlns:cx6="http://schemas.microsoft.com/office/drawing/2016/5/12/chartex" xmlns:cx7="http://schemas.microsoft.com/office/drawing/2016/5/13/chartex" xmlns:cx8="http://schemas.microsoft.com/office/drawing/2016/5/14/chartex" xmlns:mc="http://schemas.openxmlformats.org/markup-compatibility/2006" xmlns:aink="http://schemas.microsoft.com/office/drawing/2016/ink" xmlns:am3d="http://schemas.microsoft.com/office/drawing/2017/model3d" xmlns:o="urn:schemas-microsoft-com:office:office" xmlns:oel="http://schemas.microsoft.com/office/2019/extlst" xmlns:r="http://schemas.openxmlformats.org/officeDocument/2006/relationships" xmlns:m="http://schemas.openxmlformats.org/officeDocument/2006/math" xmlns:v="urn:schemas-microsoft-com:vml" xmlns:wp14="http://schemas.microsoft.com/office/word/2010/wordprocessingDrawing" xmlns:wp="http://schemas.openxmlformats.org/drawingml/2006/wordprocessingDrawing" xmlns:w10="urn:schemas-microsoft-com:office:word" xmlns:w="http://schemas.openxmlformats.org/wordprocessingml/2006/main" xmlns:w14="http://schemas.microsoft.com/office/word/2010/wordml" xmlns:w15="http://schemas.microsoft.com/office/word/2012/wordml" xmlns:w16cex="http://schemas.microsoft.com/office/word/2018/wordml/cex" xmlns:w16cid="http://schemas.microsoft.com/office/word/2016/wordml/cid" xmlns:w16="http://schemas.microsoft.com/office/word/2018/wordml" xmlns:w16du="http://schemas.microsoft.com/office/word/2023/wordml/word16du" xmlns:w16sdtdh="http://schemas.microsoft.com/office/word/2020/wordml/sdtdatahash" xmlns:w16sdtfl="http://schemas.microsoft.com/office/word/2024/wordml/sdtformatlock" xmlns:w16se="http://schemas.microsoft.com/office/word/2015/wordml/symex" xmlns:wpg="http://schemas.microsoft.com/office/word/2010/wordprocessingGroup" xmlns:wpi="http://schemas.microsoft.com/office/word/2010/wordprocessingInk" xmlns:wne="http://schemas.microsoft.com/office/word/2006/wordml" xmlns:wps="http://schemas.microsoft.com/office/word/2010/wordprocessingShape" mc:Ignorable="w14 w15 w16se w16cid w16 w16cex w16sdtdh w16sdtfl w16du wp14">
   <w:p>
@@ -517,7 +548,7 @@
       <mc:AlternateContent>
         <mc:Choice Requires="wps">
           <w:drawing>
-            <wp:anchor distT="0" distB="0" distL="114300" distR="114300" simplePos="0" relativeHeight="251659264" behindDoc="0" locked="0" layoutInCell="1" allowOverlap="1" wp14:anchorId="3A78309A" wp14:editId="2FED4CA1">
+            <wp:anchor distT="0" distB="0" distL="114300" distR="114300" simplePos="0" relativeHeight="251657728" behindDoc="0" locked="0" layoutInCell="1" allowOverlap="1" wp14:anchorId="3A78309A" wp14:editId="2FED4CA1">
               <wp:simplePos x="0" y="0"/>
               <wp:positionH relativeFrom="column">
                 <wp:posOffset>0</wp:posOffset>
@@ -577,6 +608,25 @@
 </w:ftr>
 </file>
 
+<file path=word/footnotes.xml><?xml version="1.0" encoding="utf-8"?>
+<w:footnotes xmlns:wpc="http://schemas.microsoft.com/office/word/2010/wordprocessingCanvas" xmlns:cx="http://schemas.microsoft.com/office/drawing/2014/chartex" xmlns:cx1="http://schemas.microsoft.com/office/drawing/2015/9/8/chartex" xmlns:cx2="http://schemas.microsoft.com/office/drawing/2015/10/21/chartex" xmlns:cx3="http://schemas.microsoft.com/office/drawing/2016/5/9/chartex" xmlns:cx4="http://schemas.microsoft.com/office/drawing/2016/5/10/chartex" xmlns:cx5="http://schemas.microsoft.com/office/drawing/2016/5/11/chartex" xmlns:cx6="http://schemas.microsoft.com/office/drawing/2016/5/12/chartex" xmlns:cx7="http://schemas.microsoft.com/office/drawing/2016/5/13/chartex" xmlns:cx8="http://schemas.microsoft.com/office/drawing/2016/5/14/chartex" xmlns:mc="http://schemas.openxmlformats.org/markup-compatibility/2006" xmlns:aink="http://schemas.microsoft.com/office/drawing/2016/ink" xmlns:am3d="http://schemas.microsoft.com/office/drawing/2017/model3d" xmlns:o="urn:schemas-microsoft-com:office:office" xmlns:oel="http://schemas.microsoft.com/office/2019/extlst" xmlns:r="http://schemas.openxmlformats.org/officeDocument/2006/relationships" xmlns:m="http://schemas.openxmlformats.org/officeDocument/2006/math" xmlns:v="urn:schemas-microsoft-com:vml" xmlns:wp14="http://schemas.microsoft.com/office/word/2010/wordprocessingDrawing" xmlns:wp="http://schemas.openxmlformats.org/drawingml/2006/wordprocessingDrawing" xmlns:w10="urn:schemas-microsoft-com:office:word" xmlns:w="http://schemas.openxmlformats.org/wordprocessingml/2006/main" xmlns:w14="http://schemas.microsoft.com/office/word/2010/wordml" xmlns:w15="http://schemas.microsoft.com/office/word/2012/wordml" xmlns:w16cex="http://schemas.microsoft.com/office/word/2018/wordml/cex" xmlns:w16cid="http://schemas.microsoft.com/office/word/2016/wordml/cid" xmlns:w16="http://schemas.microsoft.com/office/word/2018/wordml" xmlns:w16du="http://schemas.microsoft.com/office/word/2023/wordml/word16du" xmlns:w16sdtdh="http://schemas.microsoft.com/office/word/2020/wordml/sdtdatahash" xmlns:w16sdtfl="http://schemas.microsoft.com/office/word/2024/wordml/sdtformatlock" xmlns:w16se="http://schemas.microsoft.com/office/word/2015/wordml/symex" xmlns:wpg="http://schemas.microsoft.com/office/word/2010/wordprocessingGroup" xmlns:wpi="http://schemas.microsoft.com/office/word/2010/wordprocessingInk" xmlns:wne="http://schemas.microsoft.com/office/word/2006/wordml" xmlns:wps="http://schemas.microsoft.com/office/word/2010/wordprocessingShape" mc:Ignorable="w14 w15 w16se w16cid w16 w16cex w16sdtdh w16sdtfl w16du wp14">
+  <w:footnote w:type="separator" w:id="-1">
+    <w:p>
+      <w:r>
+        <w:separator/>
+      </w:r>
+    </w:p>
+  </w:footnote>
+  <w:footnote w:type="continuationSeparator" w:id="0">
+    <w:p>
+      <w:r>
+        <w:continuationSeparator/>
+      </w:r>
+    </w:p>
+  </w:footnote>
+</w:footnotes>
+</file>
+
 <file path=word/header1.xml><?xml version="1.0" encoding="utf-8"?>
 <w:hdr xmlns:wpc="http://schemas.microsoft.com/office/word/2010/wordprocessingCanvas" xmlns:cx="http://schemas.microsoft.com/office/drawing/2014/chartex" xmlns:cx1="http://schemas.microsoft.com/office/drawing/2015/9/8/chartex" xmlns:cx2="http://schemas.microsoft.com/office/drawing/2015/10/21/chartex" xmlns:cx3="http://schemas.microsoft.com/office/drawing/2016/5/9/chartex" xmlns:cx4="http://schemas.microsoft.com/office/drawing/2016/5/10/chartex" xmlns:cx5="http://schemas.microsoft.com/office/drawing/2016/5/11/chartex" xmlns:cx6="http://schemas.microsoft.com/office/drawing/2016/5/12/chartex" xmlns:cx7="http://schemas.microsoft.com/office/drawing/2016/5/13/chartex" xmlns:cx8="http://schemas.microsoft.com/office/drawing/2016/5/14/chartex" xmlns:mc="http://schemas.openxmlformats.org/markup-compatibility/2006" xmlns:aink="http://schemas.microsoft.com/office/drawing/2016/ink" xmlns:am3d="http://schemas.microsoft.com/office/drawing/2017/model3d" xmlns:o="urn:schemas-microsoft-com:office:office" xmlns:oel="http://schemas.microsoft.com/office/2019/extlst" xmlns:r="http://schemas.openxmlformats.org/officeDocument/2006/relationships" xmlns:m="http://schemas.openxmlformats.org/officeDocument/2006/math" xmlns:v="urn:schemas-microsoft-com:vml" xmlns:wp14="http://schemas.microsoft.com/office/word/2010/wordprocessingDrawing" xmlns:wp="http://schemas.openxmlformats.org/drawingml/2006/wordprocessingDrawing" xmlns:w10="urn:schemas-microsoft-com:office:word" xmlns:w="http://schemas.openxmlformats.org/wordprocessingml/2006/main" xmlns:w14="http://schemas.microsoft.com/office/word/2010/wordml" xmlns:w15="http://schemas.microsoft.com/office/word/2012/wordml" xmlns:w16cex="http://schemas.microsoft.com/office/word/2018/wordml/cex" xmlns:w16cid="http://schemas.microsoft.com/office/word/2016/wordml/cid" xmlns:w16="http://schemas.microsoft.com/office/word/2018/wordml" xmlns:w16du="http://schemas.microsoft.com/office/word/2023/wordml/word16du" xmlns:w16sdtdh="http://schemas.microsoft.com/office/word/2020/wordml/sdtdatahash" xmlns:w16sdtfl="http://schemas.microsoft.com/office/word/2024/wordml/sdtformatlock" xmlns:w16se="http://schemas.microsoft.com/office/word/2015/wordml/symex" xmlns:wpg="http://schemas.microsoft.com/office/word/2010/wordprocessingGroup" xmlns:wpi="http://schemas.microsoft.com/office/word/2010/wordprocessingInk" xmlns:wne="http://schemas.microsoft.com/office/word/2006/wordml" xmlns:wps="http://schemas.microsoft.com/office/word/2010/wordprocessingShape" mc:Ignorable="w14 w15 w16se w16cid w16 w16cex w16sdtdh w16sdtfl w16du wp14">
   <w:p>
@@ -590,7 +640,7 @@
         <w:lang w:val="en-GB" w:eastAsia="en-GB"/>
       </w:rPr>
       <w:drawing>
-        <wp:anchor distT="0" distB="0" distL="114300" distR="114300" simplePos="0" relativeHeight="251659264" behindDoc="0" locked="0" layoutInCell="1" allowOverlap="1" wp14:anchorId="7DF74262" wp14:editId="11BAAFCD">
+        <wp:anchor distT="0" distB="0" distL="114300" distR="114300" simplePos="0" relativeHeight="251656704" behindDoc="0" locked="0" layoutInCell="1" allowOverlap="1" wp14:anchorId="7DF74262" wp14:editId="11BAAFCD">
           <wp:simplePos x="0" y="0"/>
           <wp:positionH relativeFrom="column">
             <wp:posOffset>38100</wp:posOffset>
@@ -704,7 +754,7 @@
       <mc:AlternateContent>
         <mc:Choice Requires="wps">
           <w:drawing>
-            <wp:anchor distT="0" distB="0" distL="114300" distR="114300" simplePos="0" relativeHeight="251660288" behindDoc="0" locked="0" layoutInCell="1" allowOverlap="1" wp14:anchorId="41F70B3D" wp14:editId="3D76ECBD">
+            <wp:anchor distT="0" distB="0" distL="114300" distR="114300" simplePos="0" relativeHeight="251658752" behindDoc="0" locked="0" layoutInCell="1" allowOverlap="1" wp14:anchorId="41F70B3D" wp14:editId="3D76ECBD">
               <wp:simplePos x="0" y="0"/>
               <wp:positionH relativeFrom="column">
                 <wp:posOffset>1905</wp:posOffset>

</xml_diff>